<commit_message>
Port Douglas Rev G: Sunny Lotay as RPEQ
Co-Authored-By: Claude Opus 5.5 <noreply@anthropic.com>
Claude-Session: https://claude.ai/code/session_01RKGFyarCMuMinKYL7AiBap
</commit_message>
<xml_diff>
--- a/FP/VP527277/Final/JCE_FP_VP527277_Final_RevG.docx
+++ b/FP/VP527277/Final/JCE_FP_VP527277_Final_RevG.docx
@@ -6783,7 +6783,7 @@
           <w:b w:val="0"/>
           <w:i w:val="0"/>
         </w:rPr>
-        <w:t>Civil 3D, Navisworks and InfraWorks; CAD standards and automation in AutoLISP and Excel VBA; drone photogrammetry and GIS. Jayden has delivered drone photogrammetry on previous projects, planning automated flight paths in DroneDeploy, capturing RTK-positioned photogrammetry and high-resolution aerial stills and video, and processing in Autodesk ReCap Pro to build point clouds and terrain surfaces for use in Autodesk InfraWorks and civil design models.</w:t>
+        <w:t>Civil 3D, Navisworks and InfraWorks; CAD standards and automation in AutoLISP and Excel VBA; Autodesk ReCap Pro, DroneDeploy and QGIS (drone capability above).</w:t>
       </w:r>
     </w:p>
     <w:p>
@@ -11050,6 +11050,71 @@
                 <w:sz w:val="18"/>
               </w:rPr>
               <w:t>$1.06/km</w:t>
+            </w:r>
+          </w:p>
+        </w:tc>
+      </w:tr>
+      <w:tr>
+        <w:trPr>
+          <w:cantSplit/>
+        </w:trPr>
+        <w:tc>
+          <w:tcPr>
+            <w:tcW w:type="dxa" w:w="3628"/>
+          </w:tcPr>
+          <w:p>
+            <w:pPr>
+              <w:keepNext/>
+              <w:spacing w:after="20"/>
+            </w:pPr>
+            <w:r/>
+            <w:r>
+              <w:rPr>
+                <w:b w:val="0"/>
+                <w:i w:val="0"/>
+                <w:sz w:val="18"/>
+              </w:rPr>
+              <w:t>Drone equipment (with JCE hourly rates for flying and processing)</w:t>
+            </w:r>
+          </w:p>
+        </w:tc>
+        <w:tc>
+          <w:tcPr>
+            <w:tcW w:type="dxa" w:w="3061"/>
+          </w:tcPr>
+          <w:p>
+            <w:pPr>
+              <w:keepNext/>
+              <w:spacing w:after="20"/>
+            </w:pPr>
+            <w:r/>
+            <w:r>
+              <w:rPr>
+                <w:b w:val="0"/>
+                <w:i w:val="0"/>
+                <w:sz w:val="18"/>
+              </w:rPr>
+              <w:t>$250/field day</w:t>
+            </w:r>
+          </w:p>
+        </w:tc>
+        <w:tc>
+          <w:tcPr>
+            <w:tcW w:type="dxa" w:w="2608"/>
+          </w:tcPr>
+          <w:p>
+            <w:pPr>
+              <w:keepNext/>
+              <w:spacing w:after="20"/>
+            </w:pPr>
+            <w:r/>
+            <w:r>
+              <w:rPr>
+                <w:b w:val="0"/>
+                <w:i w:val="0"/>
+                <w:sz w:val="18"/>
+              </w:rPr>
+              <w:t>$275.00/field day</w:t>
             </w:r>
           </w:p>
         </w:tc>

</xml_diff>

<commit_message>
Newstead Rev G: referee swap, Langtrees credit, Sunny Lotay core team
Co-Authored-By: Claude Opus 5.5 <noreply@anthropic.com>
Claude-Session: https://claude.ai/code/session_01RKGFyarCMuMinKYL7AiBap
</commit_message>
<xml_diff>
--- a/FP/VP527277/Final/JCE_FP_VP527277_Final_RevG.docx
+++ b/FP/VP527277/Final/JCE_FP_VP527277_Final_RevG.docx
@@ -445,7 +445,7 @@
                 <w:i w:val="0"/>
                 <w:sz w:val="18"/>
               </w:rPr>
-              <w:t>$ 1,635,724.20</w:t>
+              <w:t>$ 1,648,999.00</w:t>
             </w:r>
           </w:p>
         </w:tc>
@@ -550,7 +550,7 @@
           <w:b w:val="0"/>
           <w:i w:val="0"/>
         </w:rPr>
-        <w:t>The lump sum is $ 1,635,724.20 including GST for all five valuation years, with Level 3/4 bridge inspections priced separately as Council's option. Our offer stays open for 60 days after the closing time.</w:t>
+        <w:t>The lump sum is $ 1,648,999.00 including GST for all five valuation years, with Level 3/4 bridge inspections priced separately as Council's option. Our offer stays open for 60 days after the closing time.</w:t>
       </w:r>
     </w:p>
     <w:p>
@@ -3142,7 +3142,7 @@
           <w:b w:val="0"/>
           <w:i w:val="0"/>
         </w:rPr>
-        <w:t>Director review of every deliverable before it reaches Council, recorded on a checklist; one register of Council comments and how each was closed.</w:t>
+        <w:t>Director review of every deliverable before it reaches Council, and independent technical review by Sunny Lotay (RPEQ, NER) of the condition, defect and safety reports and the 10-year programs, recorded on a checklist; one register of Council comments and how each was closed.</w:t>
       </w:r>
     </w:p>
     <w:p>
@@ -3753,7 +3753,7 @@
                 <w:i w:val="0"/>
                 <w:sz w:val="18"/>
               </w:rPr>
-              <w:t>Road capture and bridge inspection are carried by partner crews; a casual field assistant and a casual GIS and rating technician support JCE; Jayden's time is planned at about 35 hours a week (Section 5.0) with other work kept out of February to March and May</w:t>
+              <w:t>Road capture and bridge inspection are carried by partner crews; a casual field assistant and a casual GIS and rating technician support JCE; Sunny Lotay, JCE's associate certifying engineer, is backup project lead; Jayden's time is planned at about 35 hours a week (Section 5.0) with other work kept out of February to March and May</w:t>
             </w:r>
           </w:p>
         </w:tc>
@@ -3770,7 +3770,7 @@
           <w:b w:val="0"/>
           <w:i w:val="0"/>
         </w:rPr>
-        <w:t>Sign-off. Reports are prepared and signed by Jayden Callen, BEng (Hons), MIEAust, as JCE's project manager. Bridge inspection reports are signed by the bridge partner's nominated bridge engineer, and the valuation report by the valuer.</w:t>
+        <w:t>Sign-off. Reports are prepared and signed by Jayden Callen, BEng (Hons), MIEAust, as JCE's project manager, after independent technical review by Sunny Lotay (RPEQ, NER), JCE's associate certifying engineer, who certifies where a registered engineer is required. Bridge inspection reports are signed by the bridge partner's nominated bridge engineer, and the valuation report by the valuer.</w:t>
       </w:r>
     </w:p>
     <w:p>
@@ -5638,6 +5638,71 @@
                 <w:sz w:val="18"/>
               </w:rPr>
               <w:t>Single point of contact; methodology, drone capture, GIS and register, QA, remaining life, defect and safety assessment, programs, valuation inputs and reports</w:t>
+            </w:r>
+          </w:p>
+        </w:tc>
+      </w:tr>
+      <w:tr>
+        <w:trPr>
+          <w:cantSplit/>
+        </w:trPr>
+        <w:tc>
+          <w:tcPr>
+            <w:tcW w:type="dxa" w:w="2494"/>
+          </w:tcPr>
+          <w:p>
+            <w:pPr>
+              <w:keepNext/>
+              <w:spacing w:after="20"/>
+            </w:pPr>
+            <w:r/>
+            <w:r>
+              <w:rPr>
+                <w:b w:val="0"/>
+                <w:i w:val="0"/>
+                <w:sz w:val="18"/>
+              </w:rPr>
+              <w:t>Associate Principal Engineer, technical reviewer and certifying engineer</w:t>
+            </w:r>
+          </w:p>
+        </w:tc>
+        <w:tc>
+          <w:tcPr>
+            <w:tcW w:type="dxa" w:w="2835"/>
+          </w:tcPr>
+          <w:p>
+            <w:pPr>
+              <w:keepNext/>
+              <w:spacing w:after="20"/>
+            </w:pPr>
+            <w:r/>
+            <w:r>
+              <w:rPr>
+                <w:b w:val="0"/>
+                <w:i w:val="0"/>
+                <w:sz w:val="18"/>
+              </w:rPr>
+              <w:t>Sunny Lotay, Associate Principal Engineer (RPEQ, NER), Lotay Civil</w:t>
+            </w:r>
+          </w:p>
+        </w:tc>
+        <w:tc>
+          <w:tcPr>
+            <w:tcW w:type="dxa" w:w="3969"/>
+          </w:tcPr>
+          <w:p>
+            <w:pPr>
+              <w:keepNext/>
+              <w:spacing w:after="20"/>
+            </w:pPr>
+            <w:r/>
+            <w:r>
+              <w:rPr>
+                <w:b w:val="0"/>
+                <w:i w:val="0"/>
+                <w:sz w:val="18"/>
+              </w:rPr>
+              <w:t>Engaged by JCE under a standing associate agreement as technical reviewer and certifying engineer on JCE commissions: independent technical review of the condition, remaining life, defect and safety reports and 10-year programs; certification where a registered engineer is required; backup project lead</w:t>
             </w:r>
           </w:p>
         </w:tc>
@@ -7279,7 +7344,7 @@
                 <w:i w:val="0"/>
                 <w:sz w:val="18"/>
               </w:rPr>
-              <w:t>$ 662,032.00</w:t>
+              <w:t>$ 667,840.00</w:t>
             </w:r>
           </w:p>
         </w:tc>
@@ -7345,7 +7410,7 @@
                 <w:i w:val="0"/>
                 <w:sz w:val="18"/>
               </w:rPr>
-              <w:t>$ 195,380.00</w:t>
+              <w:t>$ 196,880.00</w:t>
             </w:r>
           </w:p>
         </w:tc>
@@ -7411,7 +7476,7 @@
                 <w:i w:val="0"/>
                 <w:sz w:val="18"/>
               </w:rPr>
-              <w:t>$ 207,720.00</w:t>
+              <w:t>$ 209,260.00</w:t>
             </w:r>
           </w:p>
         </w:tc>
@@ -7477,7 +7542,7 @@
                 <w:i w:val="0"/>
                 <w:sz w:val="18"/>
               </w:rPr>
-              <w:t>$ 167,500.00</w:t>
+              <w:t>$ 169,090.00</w:t>
             </w:r>
           </w:p>
         </w:tc>
@@ -7543,7 +7608,7 @@
                 <w:i w:val="0"/>
                 <w:sz w:val="18"/>
               </w:rPr>
-              <w:t>$ 254,390.00</w:t>
+              <w:t>$ 256,020.00</w:t>
             </w:r>
           </w:p>
         </w:tc>
@@ -7611,7 +7676,7 @@
                 <w:i w:val="0"/>
                 <w:sz w:val="18"/>
               </w:rPr>
-              <w:t>$ 1,487,022.00</w:t>
+              <w:t>$ 1,499,090.00</w:t>
             </w:r>
           </w:p>
         </w:tc>
@@ -7679,7 +7744,7 @@
                 <w:i w:val="0"/>
                 <w:sz w:val="18"/>
               </w:rPr>
-              <w:t>$ 148,702.20</w:t>
+              <w:t>$ 149,909.00</w:t>
             </w:r>
           </w:p>
         </w:tc>
@@ -7744,7 +7809,7 @@
                 <w:i w:val="0"/>
                 <w:sz w:val="18"/>
               </w:rPr>
-              <w:t>$ 1,635,724.20</w:t>
+              <w:t>$ 1,648,999.00</w:t>
             </w:r>
           </w:p>
         </w:tc>
@@ -8253,7 +8318,7 @@
                 <w:i w:val="0"/>
                 <w:sz w:val="18"/>
               </w:rPr>
-              <w:t>K1</w:t>
+              <w:t>AS</w:t>
             </w:r>
           </w:p>
         </w:tc>
@@ -8273,7 +8338,7 @@
                 <w:i w:val="0"/>
                 <w:sz w:val="18"/>
               </w:rPr>
-              <w:t>Casual field assistant and drone visual observer: 16 field days plus travel (192 h at $55/h cost allowance) (cost plus 10%)</w:t>
+              <w:t>Associate certifying engineer (Sunny Lotay, Lotay Civil): independent technical review and certification of JCE reports, 24 h at $220/h allowance (cost plus 10%) [TBC - Jayden to confirm rate]</w:t>
             </w:r>
           </w:p>
         </w:tc>
@@ -8294,7 +8359,7 @@
                 <w:i w:val="0"/>
                 <w:sz w:val="18"/>
               </w:rPr>
-              <w:t>$ 11,616.00</w:t>
+              <w:t>$ 5,808.00</w:t>
             </w:r>
           </w:p>
         </w:tc>
@@ -8319,7 +8384,7 @@
                 <w:i w:val="0"/>
                 <w:sz w:val="18"/>
               </w:rPr>
-              <w:t>K2</w:t>
+              <w:t>K1</w:t>
             </w:r>
           </w:p>
         </w:tc>
@@ -8339,7 +8404,7 @@
                 <w:i w:val="0"/>
                 <w:sz w:val="18"/>
               </w:rPr>
-              <w:t>Casual GIS and desktop rating technician: first-pass rating from partner and drone imagery, GIS layers, register population, image index, maps (298 h at $65/h cost allowance) (cost plus 10%)</w:t>
+              <w:t>Casual field assistant and drone visual observer: 16 field days plus travel (192 h at $55/h cost allowance) (cost plus 10%)</w:t>
             </w:r>
           </w:p>
         </w:tc>
@@ -8360,7 +8425,7 @@
                 <w:i w:val="0"/>
                 <w:sz w:val="18"/>
               </w:rPr>
-              <w:t>$ 21,307.00</w:t>
+              <w:t>$ 11,616.00</w:t>
             </w:r>
           </w:p>
         </w:tc>
@@ -8385,7 +8450,7 @@
                 <w:i w:val="0"/>
                 <w:sz w:val="18"/>
               </w:rPr>
-              <w:t>EQ</w:t>
+              <w:t>K2</w:t>
             </w:r>
           </w:p>
         </w:tc>
@@ -8405,7 +8470,7 @@
                 <w:i w:val="0"/>
                 <w:sz w:val="18"/>
               </w:rPr>
-              <w:t>Drone equipment day rate (DJI Mavic 3 Enterprise with RTK, batteries, RTK corrections, processing software and storage): 17 field days at $250 per day [TBC - Jayden to confirm rate]</w:t>
+              <w:t>Casual GIS and desktop rating technician: first-pass rating from partner and drone imagery, GIS layers, register population, image index, maps (298 h at $65/h cost allowance) (cost plus 10%)</w:t>
             </w:r>
           </w:p>
         </w:tc>
@@ -8426,7 +8491,7 @@
                 <w:i w:val="0"/>
                 <w:sz w:val="18"/>
               </w:rPr>
-              <w:t>$ 4,250.00</w:t>
+              <w:t>$ 21,307.00</w:t>
             </w:r>
           </w:p>
         </w:tc>
@@ -8451,7 +8516,7 @@
                 <w:i w:val="0"/>
                 <w:sz w:val="18"/>
               </w:rPr>
-              <w:t>TR</w:t>
+              <w:t>EQ</w:t>
             </w:r>
           </w:p>
         </w:tc>
@@ -8471,7 +8536,7 @@
                 <w:i w:val="0"/>
                 <w:sz w:val="18"/>
               </w:rPr>
-              <w:t>Vehicle, accommodation and meals for the drone campaigns and pilot [TBC - Jayden to confirm rates]</w:t>
+              <w:t>Drone equipment day rate (DJI Mavic 3 Enterprise with RTK, batteries, RTK corrections, processing software and storage): 17 field days at $250 per day [TBC - Jayden to confirm rate]</w:t>
             </w:r>
           </w:p>
         </w:tc>
@@ -8492,7 +8557,7 @@
                 <w:i w:val="0"/>
                 <w:sz w:val="18"/>
               </w:rPr>
-              <w:t>$ 20,744.00</w:t>
+              <w:t>$ 4,250.00</w:t>
             </w:r>
           </w:p>
         </w:tc>
@@ -8517,7 +8582,7 @@
                 <w:i w:val="0"/>
                 <w:sz w:val="18"/>
               </w:rPr>
-              <w:t>PS1</w:t>
+              <w:t>TR</w:t>
             </w:r>
           </w:p>
         </w:tc>
@@ -8537,7 +8602,7 @@
                 <w:i w:val="0"/>
                 <w:sz w:val="18"/>
               </w:rPr>
-              <w:t>Road imaging partner: vehicle-mounted network imaging and road condition rating (provisional sum, cost plus 10%)</w:t>
+              <w:t>Vehicle, accommodation and meals for the drone campaigns and pilot [TBC - Jayden to confirm rates]</w:t>
             </w:r>
           </w:p>
         </w:tc>
@@ -8558,7 +8623,7 @@
                 <w:i w:val="0"/>
                 <w:sz w:val="18"/>
               </w:rPr>
-              <w:t>$ 255,035.00</w:t>
+              <w:t>$ 20,744.00</w:t>
             </w:r>
           </w:p>
         </w:tc>
@@ -8583,7 +8648,7 @@
                 <w:i w:val="0"/>
                 <w:sz w:val="18"/>
               </w:rPr>
-              <w:t>PS2</w:t>
+              <w:t>PS1</w:t>
             </w:r>
           </w:p>
         </w:tc>
@@ -8603,7 +8668,7 @@
                 <w:i w:val="0"/>
                 <w:sz w:val="18"/>
               </w:rPr>
-              <w:t>Bridge inspection partner: Level 2 inspections of 127 structures (provisional sum, cost plus 10%)</w:t>
+              <w:t>Road imaging partner: vehicle-mounted network imaging and road condition rating (provisional sum, cost plus 10%)</w:t>
             </w:r>
           </w:p>
         </w:tc>
@@ -8624,7 +8689,7 @@
                 <w:i w:val="0"/>
                 <w:sz w:val="18"/>
               </w:rPr>
-              <w:t>$ 129,140.00</w:t>
+              <w:t>$ 255,035.00</w:t>
             </w:r>
           </w:p>
         </w:tc>
@@ -8649,7 +8714,7 @@
                 <w:i w:val="0"/>
                 <w:sz w:val="18"/>
               </w:rPr>
-              <w:t>PS3</w:t>
+              <w:t>PS2</w:t>
             </w:r>
           </w:p>
         </w:tc>
@@ -8669,7 +8734,7 @@
                 <w:i w:val="0"/>
                 <w:sz w:val="18"/>
               </w:rPr>
-              <w:t>Valuer: methodology and unit rate review, signed valuation report (provisional sum, cost plus 10%)</w:t>
+              <w:t>Bridge inspection partner: Level 2 inspections of 127 structures (provisional sum, cost plus 10%)</w:t>
             </w:r>
           </w:p>
         </w:tc>
@@ -8690,7 +8755,7 @@
                 <w:i w:val="0"/>
                 <w:sz w:val="18"/>
               </w:rPr>
-              <w:t>$ 33,000.00</w:t>
+              <w:t>$ 129,140.00</w:t>
             </w:r>
           </w:p>
         </w:tc>
@@ -8715,7 +8780,7 @@
                 <w:i w:val="0"/>
                 <w:sz w:val="18"/>
               </w:rPr>
-              <w:t>PS3b</w:t>
+              <w:t>PS3</w:t>
             </w:r>
           </w:p>
         </w:tc>
@@ -8735,7 +8800,7 @@
                 <w:i w:val="0"/>
                 <w:sz w:val="18"/>
               </w:rPr>
-              <w:t>Valuer: valuation calculations and benchmark unit rates (provisional sum, cost plus 10%)</w:t>
+              <w:t>Valuer: methodology and unit rate review, signed valuation report (provisional sum, cost plus 10%)</w:t>
             </w:r>
           </w:p>
         </w:tc>
@@ -8756,7 +8821,7 @@
                 <w:i w:val="0"/>
                 <w:sz w:val="18"/>
               </w:rPr>
-              <w:t>$ 19,800.00</w:t>
+              <w:t>$ 33,000.00</w:t>
             </w:r>
           </w:p>
         </w:tc>
@@ -8768,6 +8833,72 @@
         <w:tc>
           <w:tcPr>
             <w:tcW w:type="dxa" w:w="907"/>
+          </w:tcPr>
+          <w:p>
+            <w:pPr>
+              <w:keepNext w:val="0"/>
+              <w:spacing w:after="20"/>
+            </w:pPr>
+            <w:r/>
+            <w:r>
+              <w:rPr>
+                <w:b w:val="0"/>
+                <w:i w:val="0"/>
+                <w:sz w:val="18"/>
+              </w:rPr>
+              <w:t>PS3b</w:t>
+            </w:r>
+          </w:p>
+        </w:tc>
+        <w:tc>
+          <w:tcPr>
+            <w:tcW w:type="dxa" w:w="6350"/>
+          </w:tcPr>
+          <w:p>
+            <w:pPr>
+              <w:keepNext w:val="0"/>
+              <w:spacing w:after="20"/>
+            </w:pPr>
+            <w:r/>
+            <w:r>
+              <w:rPr>
+                <w:b w:val="0"/>
+                <w:i w:val="0"/>
+                <w:sz w:val="18"/>
+              </w:rPr>
+              <w:t>Valuer: valuation calculations and benchmark unit rates (provisional sum, cost plus 10%)</w:t>
+            </w:r>
+          </w:p>
+        </w:tc>
+        <w:tc>
+          <w:tcPr>
+            <w:tcW w:type="dxa" w:w="2041"/>
+          </w:tcPr>
+          <w:p>
+            <w:pPr>
+              <w:keepNext w:val="0"/>
+              <w:spacing w:after="20"/>
+              <w:jc w:val="right"/>
+            </w:pPr>
+            <w:r/>
+            <w:r>
+              <w:rPr>
+                <w:b w:val="0"/>
+                <w:i w:val="0"/>
+                <w:sz w:val="18"/>
+              </w:rPr>
+              <w:t>$ 19,800.00</w:t>
+            </w:r>
+          </w:p>
+        </w:tc>
+      </w:tr>
+      <w:tr>
+        <w:trPr>
+          <w:cantSplit/>
+        </w:trPr>
+        <w:tc>
+          <w:tcPr>
+            <w:tcW w:type="dxa" w:w="907"/>
             <w:shd w:val="clear" w:color="auto" w:fill="F4ECD0"/>
           </w:tcPr>
           <w:p>
@@ -8821,7 +8952,7 @@
                 <w:i w:val="0"/>
                 <w:sz w:val="18"/>
               </w:rPr>
-              <w:t>$ 662,032.00</w:t>
+              <w:t>$ 667,840.00</w:t>
             </w:r>
           </w:p>
         </w:tc>
@@ -8975,7 +9106,7 @@
                 <w:i w:val="0"/>
                 <w:sz w:val="18"/>
               </w:rPr>
-              <w:t>$ 173,736.12</w:t>
+              <w:t>$ 175,260.30</w:t>
             </w:r>
           </w:p>
         </w:tc>
@@ -9041,7 +9172,7 @@
                 <w:i w:val="0"/>
                 <w:sz w:val="18"/>
               </w:rPr>
-              <w:t>$ 180,779.47</w:t>
+              <w:t>$ 182,365.45</w:t>
             </w:r>
           </w:p>
         </w:tc>
@@ -9107,7 +9238,7 @@
                 <w:i w:val="0"/>
                 <w:sz w:val="18"/>
               </w:rPr>
-              <w:t>$ 9,182.45</w:t>
+              <w:t>$ 9,263.01</w:t>
             </w:r>
           </w:p>
         </w:tc>
@@ -9173,7 +9304,7 @@
                 <w:i w:val="0"/>
                 <w:sz w:val="18"/>
               </w:rPr>
-              <w:t>$ 23,147.42</w:t>
+              <w:t>$ 23,350.50</w:t>
             </w:r>
           </w:p>
         </w:tc>
@@ -9239,7 +9370,7 @@
                 <w:i w:val="0"/>
                 <w:sz w:val="18"/>
               </w:rPr>
-              <w:t>$ 6,495.54</w:t>
+              <w:t>$ 6,552.52</w:t>
             </w:r>
           </w:p>
         </w:tc>
@@ -9305,7 +9436,7 @@
                 <w:i w:val="0"/>
                 <w:sz w:val="18"/>
               </w:rPr>
-              <w:t>$ 13,147.60</w:t>
+              <w:t>$ 13,262.94</w:t>
             </w:r>
           </w:p>
         </w:tc>
@@ -9371,7 +9502,7 @@
                 <w:i w:val="0"/>
                 <w:sz w:val="18"/>
               </w:rPr>
-              <w:t>$ 48,677.42</w:t>
+              <w:t>$ 49,104.46</w:t>
             </w:r>
           </w:p>
         </w:tc>
@@ -9437,7 +9568,7 @@
                 <w:i w:val="0"/>
                 <w:sz w:val="18"/>
               </w:rPr>
-              <w:t>$ 21,738.75</w:t>
+              <w:t>$ 21,929.47</w:t>
             </w:r>
           </w:p>
         </w:tc>
@@ -9503,7 +9634,7 @@
                 <w:i w:val="0"/>
                 <w:sz w:val="18"/>
               </w:rPr>
-              <w:t>$ 1,826.06</w:t>
+              <w:t>$ 1,842.08</w:t>
             </w:r>
           </w:p>
         </w:tc>
@@ -9569,7 +9700,7 @@
                 <w:i w:val="0"/>
                 <w:sz w:val="18"/>
               </w:rPr>
-              <w:t>$ 171,127.47</w:t>
+              <w:t>$ 172,628.77</w:t>
             </w:r>
           </w:p>
         </w:tc>
@@ -9635,7 +9766,7 @@
                 <w:i w:val="0"/>
                 <w:sz w:val="18"/>
               </w:rPr>
-              <w:t>$ 12,173.70</w:t>
+              <w:t>$ 12,280.50</w:t>
             </w:r>
           </w:p>
         </w:tc>
@@ -9700,7 +9831,7 @@
                 <w:i w:val="0"/>
                 <w:sz w:val="18"/>
               </w:rPr>
-              <w:t>$ 662,032.00</w:t>
+              <w:t>$ 667,840.00</w:t>
             </w:r>
           </w:p>
         </w:tc>
@@ -11268,6 +11399,15 @@
           <w:i w:val="0"/>
         </w:rPr>
         <w:t>Director and Principal Engineer, JCE Infrastructure. Project manager, drone pilot and GIS lead, and single point of contact. Bachelor of Engineering (Honours) Civil, Deakin University; Engineers Australia member 11036201; application for the National Engineering Register (civil) in progress. Drone operations under CASA's sub-2 kg excluded category (operator accreditation and drone registration in place before services start). Jayden has delivered drone photogrammetry on previous projects, planning automated flight paths in DroneDeploy, capturing RTK-positioned photogrammetry and high-resolution aerial stills and video, and processing in Autodesk ReCap Pro to build point clouds and terrain surfaces for use in Autodesk InfraWorks and civil design models. Detailed CV attached.</w:t>
+      </w:r>
+    </w:p>
+    <w:p>
+      <w:r>
+        <w:rPr>
+          <w:b w:val="0"/>
+          <w:i w:val="0"/>
+        </w:rPr>
+        <w:t>Sunny Lotay, Associate Principal Engineer (RPEQ, NER), Lotay Civil: engaged by JCE under a standing associate agreement as technical reviewer and certifying engineer on JCE commissions. His role on MRC-2645 is independent technical review of JCE's outputs, certification where a registered engineer is required, and backup project lead.</w:t>
       </w:r>
     </w:p>
     <w:p>

</xml_diff>